<commit_message>
Complete port-model fit revision with verified empirical examples
Co-Authored-By: Claude Opus 5.5 <noreply@anthropic.com>
Claude-Session: https://claude.ai/code/session_01EARyaH78jfr9YdoQ2kyo5P
</commit_message>
<xml_diff>
--- a/examiner4/07_Ch4_port_model_fit.docx
+++ b/examiner4/07_Ch4_port_model_fit.docx
@@ -610,7 +610,7 @@
         <w:rPr>
           <w:color w:val="7030A0"/>
         </w:rPr>
-        <w:t xml:space="preserve">Fourth, the measurement model of the port case is strong. Most standardised loadings are above 0.8, all composite reliabilities exceed 0.8 and all AVE values exceed 0.5 (Table 13). Global fit indices, the RMSEA in particular, depend on measurement quality: for the same degree of misspecification, models with highly reliable indicators appear to fit worse than models with weaker indicators (Hancock &amp; Mueller, 2011; Heene et al., 2011). McNeish et al. (2018) show that an RMSEA that signals poor fit when loadings are low can correspond to acceptable fit when loadings are high. Fixed cutoffs therefore tend to penalise models such as this one, whose indicators load strongly on their constructs. Fifth, the indicators are secondary statistics compiled by the OECD, the World Bank and the Quality of Government Institute for other purposes, rather than survey items designed to measure each construct. Such indicators can share variance through their common sources and definitions, and some may behave more as composite or causal indicators than as reflective ones (Bollen &amp; Bauldry, 2011), which lowers global fit. Finally, the port model reproduces the structure and the direction of the relationships found in the general transport model, which fits acceptably (Section 4.4.1), and all its hypothesised paths are statistically significant and consistent with theory. [Sentence on empirical studies to be added: applied studies that have reported and interpreted models with RMSEA above 0.10 or TLI below 0.90.]</w:t>
+        <w:t xml:space="preserve">Fourth, the measurement model of the port case is strong. Most standardised loadings are above 0.8, all composite reliabilities exceed 0.8 and all AVE values exceed 0.5 (Table 13). Global fit indices, the RMSEA in particular, depend on measurement quality: for the same degree of misspecification, models with highly reliable indicators appear to fit worse than models with weaker indicators (Hancock &amp; Mueller, 2011; Heene et al., 2011). McNeish et al. (2018) show that an RMSEA that signals poor fit when loadings are low can correspond to acceptable fit when loadings are high. Fixed cutoffs therefore tend to penalise models such as this one, whose indicators load strongly on their constructs. Fifth, the indicators are secondary statistics compiled by the OECD, the World Bank and the Quality of Government Institute for other purposes, rather than survey items designed to measure each construct. Such indicators can share variance through their common sources and definitions, and some may behave more as composite or causal indicators than as reflective ones (Bollen &amp; Bauldry, 2011), which lowers global fit. Finally, the port model reproduces the structure and the direction of the relationships found in the general transport model, which fits acceptably (Section 4.4.1), and all its hypothesised paths are statistically significant and consistent with theory. Applied studies in the maritime field have likewise interpreted models whose fit falls short of some conventional cutoffs. In a secondary analysis of seafarer survey data, McVeigh et al. (2019) retained and interpreted a model with CFI = 0.87 and TLI = 0.83, while noting that these two indices indicated less than satisfactory fit. Using secondary country-level data on port infrastructure and logistics performance for 91 countries, a design close to that of this chapter, Munim and Schramm (2018) interpreted a structural model with RMSEA values of 0.08–0.09, which lie in the mediocre range.</w:t>
       </w:r>
     </w:p>
     <w:p>
@@ -675,6 +675,19 @@
           <w:color w:val="606060"/>
         </w:rPr>
         <w:t xml:space="preserve">, but only if that is what your output shows. Both are optional; do not add either unless you have checked the output.</w:t>
+      </w:r>
+    </w:p>
+    <w:p>
+      <w:pPr>
+        <w:pStyle w:val="BlockText"/>
+      </w:pPr>
+      <w:r>
+        <w:rPr>
+          <w:iCs/>
+          <w:i/>
+          <w:color w:val="606060"/>
+        </w:rPr>
+        <w:t xml:space="preserve">On the empirical studies: I could verify only two published studies from reputable publishers that interpret models with fit below some conventional cutoffs. McVeigh et al. (2019, Frontiers, outside your preferred publishers) has TLI = 0.83 with a model retained. Munim and Schramm (2018, Springer), the closest design to yours (secondary country-level port data, 228 observations), has RMSEA 0.08–0.09 but not above 0.10. I found no verified port or transport study from the preferred publishers that accepts an RMSEA above 0.10, so the text does not claim that such studies exist. If you know of one from your own reading, send it and I will check it.</w:t>
       </w:r>
     </w:p>
     <w:bookmarkEnd w:id="22"/>
@@ -834,7 +847,7 @@
         <w:rPr>
           <w:color w:val="7030A0"/>
         </w:rPr>
-        <w:t xml:space="preserve">We have added an explanation of why the model nonetheless remains informative about the direction of the relationships, with reference to the methodological literature. Fit cutoffs are rules of thumb rather than universal criteria (Chen et al., 2008; Marsh et al., 2004). The TLI and the RMSEA tend to over-reject in modest samples (Hu &amp; Bentler, 1999; Shi et al., 2019). Disagreement between the CFI and the RMSEA does not by itself diagnose misspecification (Lai &amp; Green, 2016). And global fit indices penalise models with highly reliable indicators, such as this one (Hancock &amp; Mueller, 2011; McNeish et al., 2018). The text also notes that the indicators are secondary statistics not designed for these constructs, that the port model reproduces the pattern of the general model, and that other applied studies have reported and interpreted models with comparable fit values. In line with the examiner’s comment, we have added a limitation in Section 4.6 stating that the port-specific path coefficients indicate the direction and significance of the relationships rather than their precise magnitude. In addition, we have corrected the description of the general model’s fit in Section 4.4.1 so that each threshold is attributed accurately.</w:t>
+        <w:t xml:space="preserve">We have added an explanation of why the model nonetheless remains informative about the direction of the relationships, with reference to the methodological literature. Fit cutoffs are rules of thumb rather than universal criteria (Chen et al., 2008; Marsh et al., 2004). The TLI and the RMSEA tend to over-reject in modest samples (Hu &amp; Bentler, 1999; Shi et al., 2019). Disagreement between the CFI and the RMSEA does not by itself diagnose misspecification (Lai &amp; Green, 2016). And global fit indices penalise models with highly reliable indicators, such as this one (Hancock &amp; Mueller, 2011; McNeish et al., 2018). The text also notes that the indicators are secondary statistics not designed for these constructs, that the port model reproduces the pattern of the general model, and that applied maritime studies have interpreted models whose fit falls short of some conventional cutoffs (McVeigh et al., 2019; Munim &amp; Schramm, 2018). In line with the examiner’s comment, we have added a limitation in Section 4.6 stating that the port-specific path coefficients indicate the direction and significance of the relationships rather than their precise magnitude. In addition, we have corrected the description of the general model’s fit in Section 4.4.1 so that each threshold is attributed accurately.</w:t>
       </w:r>
     </w:p>
     <w:bookmarkEnd w:id="24"/>
@@ -1184,6 +1197,37 @@
         <w:rPr>
           <w:color w:val="7030A0"/>
         </w:rPr>
+        <w:t xml:space="preserve">McVeigh, J., MacLachlan, M., Vallières, F., Hyland, P., Stilz, R., Cox, H., &amp; Fraser, A. (2019). Identifying predictors of stress and job satisfaction in a sample of merchant seafarers using structural equation modeling.</w:t>
+      </w:r>
+      <w:r>
+        <w:rPr>
+          <w:color w:val="7030A0"/>
+        </w:rPr>
+        <w:t xml:space="preserve"> </w:t>
+      </w:r>
+      <w:r>
+        <w:rPr>
+          <w:iCs/>
+          <w:i/>
+          <w:color w:val="7030A0"/>
+        </w:rPr>
+        <w:t xml:space="preserve">Frontiers in Psychology, 10</w:t>
+      </w:r>
+      <w:r>
+        <w:rPr>
+          <w:color w:val="7030A0"/>
+        </w:rPr>
+        <w:t xml:space="preserve">, 70. https://doi.org/10.3389/fpsyg.2019.00070</w:t>
+      </w:r>
+    </w:p>
+    <w:p>
+      <w:pPr>
+        <w:pStyle w:val="BodyText"/>
+      </w:pPr>
+      <w:r>
+        <w:rPr>
+          <w:color w:val="7030A0"/>
+        </w:rPr>
         <w:t xml:space="preserve">Marsh, H. W., Hau, K.-T., &amp; Wen, Z. (2004). In search of golden rules: Comment on hypothesis-testing approaches to setting cutoff values for fit indexes and dangers in overgeneralizing Hu and Bentler’s (1999) findings.</w:t>
       </w:r>
       <w:r>
@@ -1236,6 +1280,37 @@
           <w:color w:val="7030A0"/>
         </w:rPr>
         <w:t xml:space="preserve">(1), 43–52. https://doi.org/10.1080/00223891.2017.1281286</w:t>
+      </w:r>
+    </w:p>
+    <w:p>
+      <w:pPr>
+        <w:pStyle w:val="BodyText"/>
+      </w:pPr>
+      <w:r>
+        <w:rPr>
+          <w:color w:val="7030A0"/>
+        </w:rPr>
+        <w:t xml:space="preserve">Munim, Z. H., &amp; Schramm, H.-J. (2018). The impacts of port infrastructure and logistics performance on economic growth: The mediating role of seaborne trade.</w:t>
+      </w:r>
+      <w:r>
+        <w:rPr>
+          <w:color w:val="7030A0"/>
+        </w:rPr>
+        <w:t xml:space="preserve"> </w:t>
+      </w:r>
+      <w:r>
+        <w:rPr>
+          <w:iCs/>
+          <w:i/>
+          <w:color w:val="7030A0"/>
+        </w:rPr>
+        <w:t xml:space="preserve">Journal of Shipping and Trade, 3</w:t>
+      </w:r>
+      <w:r>
+        <w:rPr>
+          <w:color w:val="7030A0"/>
+        </w:rPr>
+        <w:t xml:space="preserve">(1), 1. https://doi.org/10.1186/s41072-018-0027-0</w:t>
       </w:r>
     </w:p>
     <w:p>

</xml_diff>